<commit_message>
Correcciones del docente: Lab 1 pide la lista de tarjetas visible (no el chat); Tarea 3 sin líneas 'Se asigna/Se entrega'; sesión 2 sin el slide de Nano Banana (queda solo la mención del cierre)
</commit_message>
<xml_diff>
--- a/asignaciones/laboratorio-1-primera-app.docx
+++ b/asignaciones/laboratorio-1-primera-app.docx
@@ -281,7 +281,23 @@
           <w:color w:val="2B2B2B"/>
           <w:lang w:val="es-419"/>
         </w:rPr>
-        <w:t>u app generada en AI Studio con la lista de tarjetas visible y al menos un refinamiento aplicado</w:t>
+        <w:t xml:space="preserve">u app generada en AI Studio con </w:t>
+      </w:r>
+      <w:r>
+        <w:rPr>
+          <w:rFonts w:ascii="Calibri" w:hAnsi="Calibri"/>
+          <w:color w:val="2B2B2B"/>
+          <w:lang w:val="es-419"/>
+        </w:rPr>
+        <w:t>el chat</w:t>
+      </w:r>
+      <w:r>
+        <w:rPr>
+          <w:rFonts w:ascii="Calibri" w:hAnsi="Calibri"/>
+          <w:color w:val="2B2B2B"/>
+          <w:lang w:val="es-419"/>
+        </w:rPr>
+        <w:t xml:space="preserve"> visible y al menos un refinamiento aplicado</w:t>
       </w:r>
     </w:p>
     <w:p>

</xml_diff>